<commit_message>
Se actualizo la documentacion y se genero el instalador despues de los cambios realizados
</commit_message>
<xml_diff>
--- a/ploteo/documentos/INSTRUCCIONES_INSTALACION.docx
+++ b/ploteo/documentos/INSTRUCCIONES_INSTALACION.docx
@@ -17,7 +17,7 @@
     </w:p>
     <w:p>
       <w:r>
-        <w:t>Generado el 24/08/2026.</w:t>
+        <w:t>Generado el 02/09/2026.</w:t>
       </w:r>
     </w:p>
     <w:p>
@@ -54,7 +54,7 @@
         <w:pStyle w:val="ListBullet"/>
       </w:pPr>
       <w:r>
-        <w:t>Genera binarios ejecutables de consulta y de graficado.</w:t>
+        <w:t>Genera binarios ejecutables de consulta, de graficado y de precalentamiento de caché (este último deja módulos y datos en RAM para acelerar el arranque).</w:t>
       </w:r>
     </w:p>
     <w:p>
@@ -94,7 +94,7 @@
         <w:pStyle w:val="ListBullet"/>
       </w:pPr>
       <w:r>
-        <w:t>Antes de compilar los binarios ejecuta la MARCHA BLANCA: pruebas unitarias (pytest) sobre la lógica crítica y los datos. Si un test falla, la instalación se DETIENE. Detalle completo en INFORME_TESTS_MARCHA_BLANCA.docx.</w:t>
+        <w:t>Antes de compilar los binarios ejecuta la MARCHA BLANCA: pruebas unitarias (pytest) sobre la lógica crítica y los datos. Si un test falla, la instalación se DETIENE.</w:t>
       </w:r>
     </w:p>
     <w:p>
@@ -124,7 +124,7 @@
           <w:rFonts w:ascii="Consolas" w:hAnsi="Consolas"/>
           <w:sz w:val="19"/>
         </w:rPr>
-        <w:t>python3 -m py_compile capturar.py consulta_evento.py consuta_evento_sc7.py</w:t>
+        <w:t>python3 -m py_compile capturar.py consulta_evento.py precalentar.py lee_catalogo.py preprocesa_grillas.py</w:t>
       </w:r>
     </w:p>
     <w:p>
@@ -224,7 +224,7 @@
     </w:p>
     <w:p>
       <w:r>
-        <w:t>El modo --probar crea un venv temporal, instala los módulos con versiones fijas, corre las pruebas unitarias (ver INFORME_TESTS_MARCHA_BLANCA.docx) y borra lo temporal: no instala nada en ~/newpt.</w:t>
+        <w:t>El modo --probar crea un venv temporal, instala los módulos con versiones fijas, corre las pruebas unitarias y borra el temporal: no instala nada en ~/newpt.</w:t>
       </w:r>
     </w:p>
     <w:p>
@@ -403,7 +403,16 @@
           <w:rFonts w:ascii="Consolas" w:hAnsi="Consolas"/>
           <w:sz w:val="19"/>
         </w:rPr>
-        <w:t>├── bin/newpt_consulta/          binario de la consulta</w:t>
+        <w:t>├── bin/newpt_consulta/          binario de la consulta BD</w:t>
+      </w:r>
+    </w:p>
+    <w:p>
+      <w:r>
+        <w:rPr>
+          <w:rFonts w:ascii="Consolas" w:hAnsi="Consolas"/>
+          <w:sz w:val="19"/>
+        </w:rPr>
+        <w:t>├── bin/newpt_precalentar/       binario de precalentamiento de caché</w:t>
       </w:r>
     </w:p>
     <w:p>
@@ -421,7 +430,16 @@
           <w:rFonts w:ascii="Consolas" w:hAnsi="Consolas"/>
           <w:sz w:val="19"/>
         </w:rPr>
-        <w:t>├── NE2_LR_LC_SR_W_DR.tif        imagen de relieve</w:t>
+        <w:t>├── NE2_LR_LC_SR_W_DR.tif        imagen de relieve global (respaldo)</w:t>
+      </w:r>
+    </w:p>
+    <w:p>
+      <w:r>
+        <w:rPr>
+          <w:rFonts w:ascii="Consolas" w:hAnsi="Consolas"/>
+          <w:sz w:val="19"/>
+        </w:rPr>
+        <w:t>├── relieve_chile.tif            relieve recortado a zona de trabajo</w:t>
       </w:r>
     </w:p>
     <w:p>

</xml_diff>

<commit_message>
Actualizacion del esquema de BD, instalador y documentacion
- Esquema BD SeisComp6: el titulo refleja que es el subconjunto de la
  solucion preferida; tooltips por tabla con columnas y descripcion;
  nota m_publicid sin duplicados (generador idempotente).
- Mediciones del flujo: mediciones.py y precalentar.py registran hitos
  por fase en newpt_metricas.tsv para diagnosticar la demora de 40 s.
- Instalador: crear_instalador.sh y instalar_newpt.sh incluyen
  mediciones.py en fuentes/ (dependencia de capturar/consulta/precalentar)
  y lo validan; se regenero newpt_instalador.tar.gz.
- Documentos: INSTRUCCIONES_INSTALACION.docx regenerado (menciona
  mediciones.py); informe tecnico v4 y manual_NewPT actualizados
  (precalentamiento, mediciones por fase y perfil 3D).
</commit_message>
<xml_diff>
--- a/ploteo/documentos/INSTRUCCIONES_INSTALACION.docx
+++ b/ploteo/documentos/INSTRUCCIONES_INSTALACION.docx
@@ -17,7 +17,7 @@
     </w:p>
     <w:p>
       <w:r>
-        <w:t>Generado el 02/09/2026.</w:t>
+        <w:t>Generado el 08/09/2026.</w:t>
       </w:r>
     </w:p>
     <w:p>
@@ -55,6 +55,14 @@
       </w:pPr>
       <w:r>
         <w:t>Genera binarios ejecutables de consulta, de graficado y de precalentamiento de caché (este último deja módulos y datos en RAM para acelerar el arranque).</w:t>
+      </w:r>
+    </w:p>
+    <w:p>
+      <w:pPr>
+        <w:pStyle w:val="ListBullet"/>
+      </w:pPr>
+      <w:r>
+        <w:t>Los binarios registran por fase el tiempo que invierte cada paso usando el módulo mediciones.py y lo guardan en newpt_metricas.tsv en la carpeta de datos: se usa para diagnosticar demoras (como la de ~40 s ya corregida).</w:t>
       </w:r>
     </w:p>
     <w:p>
@@ -124,7 +132,7 @@
           <w:rFonts w:ascii="Consolas" w:hAnsi="Consolas"/>
           <w:sz w:val="19"/>
         </w:rPr>
-        <w:t>python3 -m py_compile capturar.py consulta_evento.py precalentar.py lee_catalogo.py preprocesa_grillas.py</w:t>
+        <w:t>python3 -m py_compile capturar.py consulta_evento.py precalentar.py mediciones.py lee_catalogo.py preprocesa_grillas.py</w:t>
       </w:r>
     </w:p>
     <w:p>

</xml_diff>

<commit_message>
Cambios en los scripts que generar informes de las pruebas unitarias. Tambien se actualizaron los documentos de instrucciones de insstalacion del proyecto y de la lista de los software de prerequisitos.
</commit_message>
<xml_diff>
--- a/ploteo/documentos/INSTRUCCIONES_INSTALACION.docx
+++ b/ploteo/documentos/INSTRUCCIONES_INSTALACION.docx
@@ -17,7 +17,7 @@
     </w:p>
     <w:p>
       <w:r>
-        <w:t>Generado el 08/09/2026.</w:t>
+        <w:t>Generado el 09/09/2026.</w:t>
       </w:r>
     </w:p>
     <w:p>
@@ -273,7 +273,7 @@
           <w:rFonts w:ascii="Consolas" w:hAnsi="Consolas"/>
           <w:sz w:val="19"/>
         </w:rPr>
-        <w:t>sudo apt install -y python3 python3-venv python3-tk xterm</w:t>
+        <w:t>sudo apt install -y python3 python3-venv python3-tk xterm binutils</w:t>
       </w:r>
     </w:p>
     <w:p>
@@ -342,7 +342,7 @@
         <w:pStyle w:val="ListBullet"/>
       </w:pPr>
       <w:r>
-        <w:t>Los programas del sistema (python3, python3-tk, xterm) ya están instalados: no se vuelven a instalar.</w:t>
+        <w:t>Los programas del sistema (python3, python3-venv, python3-tk, xterm, binutils) ya están instalados: no se vuelven a instalar.</w:t>
       </w:r>
     </w:p>
     <w:p>
@@ -672,7 +672,7 @@
         <w:pStyle w:val="ListBullet"/>
       </w:pPr>
       <w:r>
-        <w:t>Distribuciones RHEL/CentOS/Rocky: los equivalentes son sudo dnf install -y python3 python3-virtualenv tkinter xterm.</w:t>
+        <w:t>Distribuciones RHEL/CentOS/Rocky: los equivalentes son sudo dnf install -y python3 python3-virtualenv tkinter xterm binutils.</w:t>
       </w:r>
     </w:p>
     <w:p>

</xml_diff>